<commit_message>
Mission Control V4 Optimized: Gemini 2.5 Neural Upgrade & Doctoralia Sync. - Migrated NeuroEngine to 2026-gen 'gemini-2.5-flash' and 'gemini-2.5-pro' models. - Fixed 404/500 API connectivity issues by synchronizing with verified model registry. - Restored Doctoralia Assistant functionality with corrected element selectors and dedicated endpoint. - Optimized 'Dual-Brain' cognitive routing for maximum clinical fidelity and performance.
</commit_message>
<xml_diff>
--- a/docs/Curriculo - Victor Lawrence Bernardes Santana.docx
+++ b/docs/Curriculo - Victor Lawrence Bernardes Santana.docx
@@ -82,7 +82,18 @@
           <w:lang w:eastAsia="pt-BR"/>
           <w14:ligatures w14:val="none"/>
         </w:rPr>
-        <w:t xml:space="preserve"> victorlawrence.psi@gmail.com | </w:t>
+        <w:t>instituto@hipnolawrence.com</w:t>
+      </w:r>
+      <w:r>
+        <w:rPr>
+          <w:rFonts w:eastAsia="Times New Roman" w:cs="Times New Roman"/>
+          <w:kern w:val="0"/>
+          <w:sz w:val="24"/>
+          <w:szCs w:val="24"/>
+          <w:lang w:eastAsia="pt-BR"/>
+          <w14:ligatures w14:val="none"/>
+        </w:rPr>
+        <w:t xml:space="preserve"> | </w:t>
       </w:r>
       <w:r>
         <w:rPr>
@@ -104,7 +115,29 @@
           <w:lang w:eastAsia="pt-BR"/>
           <w14:ligatures w14:val="none"/>
         </w:rPr>
-        <w:t xml:space="preserve"> (62) 98217-1845 | </w:t>
+        <w:t xml:space="preserve"> (62)</w:t>
+      </w:r>
+      <w:r>
+        <w:rPr>
+          <w:rFonts w:eastAsia="Times New Roman" w:cs="Times New Roman"/>
+          <w:kern w:val="0"/>
+          <w:sz w:val="24"/>
+          <w:szCs w:val="24"/>
+          <w:lang w:eastAsia="pt-BR"/>
+          <w14:ligatures w14:val="none"/>
+        </w:rPr>
+        <w:t xml:space="preserve"> 99154-5295</w:t>
+      </w:r>
+      <w:r>
+        <w:rPr>
+          <w:rFonts w:eastAsia="Times New Roman" w:cs="Times New Roman"/>
+          <w:kern w:val="0"/>
+          <w:sz w:val="24"/>
+          <w:szCs w:val="24"/>
+          <w:lang w:eastAsia="pt-BR"/>
+          <w14:ligatures w14:val="none"/>
+        </w:rPr>
+        <w:t xml:space="preserve"> </w:t>
       </w:r>
     </w:p>
     <w:p>
@@ -291,7 +324,7 @@
           <w14:ligatures w14:val="none"/>
         </w:rPr>
         <w:drawing>
-          <wp:anchor distT="0" distB="0" distL="114300" distR="114300" simplePos="0" relativeHeight="251658240" behindDoc="0" locked="0" layoutInCell="1" allowOverlap="1" wp14:anchorId="781E51B0" wp14:editId="06BE3A75">
+          <wp:anchor distT="0" distB="0" distL="114300" distR="114300" simplePos="0" relativeHeight="251658240" behindDoc="0" locked="0" layoutInCell="1" allowOverlap="1" wp14:anchorId="781E51B0" wp14:editId="6FE23507">
             <wp:simplePos x="0" y="0"/>
             <wp:positionH relativeFrom="margin">
               <wp:align>left</wp:align>
@@ -389,7 +422,51 @@
           <w:lang w:eastAsia="pt-BR"/>
           <w14:ligatures w14:val="none"/>
         </w:rPr>
-        <w:t>Psicólogo clínico e pesquisador com atuação desde 2016, especializado em Hipnose Ericksoniana e Programação Neurolinguística (PNL). Possui foco de pesquisa no tratamento de Transtorno do Espectro Autista (TEA) em adultos, com publicações e apresentações em congressos nacionais e internacionais. Oferece atendimento clínico e docência em inglês. Comprometido com a formação contínua, possui pós-graduação em Ciência Política e formação pela Milton H. Erickson Foundation.</w:t>
+        <w:t>Psicólogo clínico e pesquisador com atuação desde 2016, especializado em Hipnose Ericksoniana e Programação Neurolinguística (PNL).</w:t>
+      </w:r>
+      <w:r>
+        <w:rPr>
+          <w:rFonts w:eastAsia="Times New Roman" w:cs="Times New Roman"/>
+          <w:kern w:val="0"/>
+          <w:sz w:val="24"/>
+          <w:szCs w:val="24"/>
+          <w:lang w:eastAsia="pt-BR"/>
+          <w14:ligatures w14:val="none"/>
+        </w:rPr>
+        <w:t xml:space="preserve"> </w:t>
+      </w:r>
+      <w:r>
+        <w:rPr>
+          <w:rFonts w:eastAsia="Times New Roman" w:cs="Times New Roman"/>
+          <w:kern w:val="0"/>
+          <w:sz w:val="24"/>
+          <w:szCs w:val="24"/>
+          <w:lang w:eastAsia="pt-BR"/>
+          <w14:ligatures w14:val="none"/>
+        </w:rPr>
+        <w:t>Mestrando em Ciências da Saúde pela UFU. Estruturação metodológica de Ensaios Clínicos e validação psicométrica de ponta, integrando o rigor dos dados à integridade científica internacional.</w:t>
+      </w:r>
+      <w:r>
+        <w:rPr>
+          <w:rFonts w:eastAsia="Times New Roman" w:cs="Times New Roman"/>
+          <w:kern w:val="0"/>
+          <w:sz w:val="24"/>
+          <w:szCs w:val="24"/>
+          <w:lang w:eastAsia="pt-BR"/>
+          <w14:ligatures w14:val="none"/>
+        </w:rPr>
+        <w:t xml:space="preserve"> Possui foco de pesquisa no tratamento de Transtorno do Espectro Autista (TEA) em adultos, com publicações e apresentações em congressos nacionais e internacionais. Oferece atendimento clínico e docência em inglês. Comprometido com a formação contínua, possui pós-graduação em Ciência Política e formação pela Milton H. Erickson Foundation.</w:t>
+      </w:r>
+      <w:r>
+        <w:rPr>
+          <w:rFonts w:eastAsia="Times New Roman" w:cs="Times New Roman"/>
+          <w:kern w:val="0"/>
+          <w:sz w:val="24"/>
+          <w:szCs w:val="24"/>
+          <w:lang w:eastAsia="pt-BR"/>
+          <w14:ligatures w14:val="none"/>
+        </w:rPr>
+        <w:t xml:space="preserve"> </w:t>
       </w:r>
     </w:p>
     <w:p>
@@ -720,7 +797,31 @@
           <w:lang w:eastAsia="pt-BR"/>
           <w14:ligatures w14:val="none"/>
         </w:rPr>
-        <w:t xml:space="preserve"> Transtorno Obsessivo-Compulsivo (TOC) e dependência química.</w:t>
+        <w:t xml:space="preserve"> Transtorno </w:t>
+      </w:r>
+      <w:proofErr w:type="spellStart"/>
+      <w:r>
+        <w:rPr>
+          <w:rFonts w:eastAsia="Times New Roman" w:cs="Times New Roman"/>
+          <w:kern w:val="0"/>
+          <w:sz w:val="24"/>
+          <w:szCs w:val="24"/>
+          <w:lang w:eastAsia="pt-BR"/>
+          <w14:ligatures w14:val="none"/>
+        </w:rPr>
+        <w:t>Obsessivo-Compulsivo</w:t>
+      </w:r>
+      <w:proofErr w:type="spellEnd"/>
+      <w:r>
+        <w:rPr>
+          <w:rFonts w:eastAsia="Times New Roman" w:cs="Times New Roman"/>
+          <w:kern w:val="0"/>
+          <w:sz w:val="24"/>
+          <w:szCs w:val="24"/>
+          <w:lang w:eastAsia="pt-BR"/>
+          <w14:ligatures w14:val="none"/>
+        </w:rPr>
+        <w:t xml:space="preserve"> (TOC) e dependência química.</w:t>
       </w:r>
     </w:p>
     <w:p>
@@ -977,6 +1078,7 @@
           <w:lang w:eastAsia="pt-BR"/>
           <w14:ligatures w14:val="none"/>
         </w:rPr>
+        <w:lastRenderedPageBreak/>
         <w:t>Pesquisa em comunicação simbólica, psicometria e tratamento de TEA em adultos.</w:t>
       </w:r>
     </w:p>
@@ -1005,7 +1107,6 @@
           <w:lang w:eastAsia="pt-BR"/>
           <w14:ligatures w14:val="none"/>
         </w:rPr>
-        <w:lastRenderedPageBreak/>
         <w:t>Assistente de Pesquisa</w:t>
       </w:r>
       <w:r>
@@ -1209,7 +1310,31 @@
           <w:lang w:eastAsia="pt-BR"/>
           <w14:ligatures w14:val="none"/>
         </w:rPr>
-        <w:t xml:space="preserve"> (Projeto independente, 2020 – Atual) Esta linha de pesquisa investiga o refinamento da comunicação simbólica e dos fenômenos hipnóticos, inspirada em publicações como "Explorando a Comunicação Simbólica e as Estratégias Terapêuticas de Milton H. Erickson". O objetivo é ampliar os fundamentos teóricos e práticos da abordagem, propondo novos protocolos terapêuticos.</w:t>
+        <w:t xml:space="preserve"> (Projeto independente, 2020 – Atual</w:t>
+      </w:r>
+      <w:proofErr w:type="gramStart"/>
+      <w:r>
+        <w:rPr>
+          <w:rFonts w:eastAsia="Times New Roman" w:cs="Times New Roman"/>
+          <w:kern w:val="0"/>
+          <w:sz w:val="24"/>
+          <w:szCs w:val="24"/>
+          <w:lang w:eastAsia="pt-BR"/>
+          <w14:ligatures w14:val="none"/>
+        </w:rPr>
+        <w:t>) Esta</w:t>
+      </w:r>
+      <w:proofErr w:type="gramEnd"/>
+      <w:r>
+        <w:rPr>
+          <w:rFonts w:eastAsia="Times New Roman" w:cs="Times New Roman"/>
+          <w:kern w:val="0"/>
+          <w:sz w:val="24"/>
+          <w:szCs w:val="24"/>
+          <w:lang w:eastAsia="pt-BR"/>
+          <w14:ligatures w14:val="none"/>
+        </w:rPr>
+        <w:t xml:space="preserve"> linha de pesquisa investiga o refinamento da comunicação simbólica e dos fenômenos hipnóticos, inspirada em publicações como "Explorando a Comunicação Simbólica e as Estratégias Terapêuticas de Milton H. Erickson". O objetivo é ampliar os fundamentos teóricos e práticos da abordagem, propondo novos protocolos terapêuticos.</w:t>
       </w:r>
     </w:p>
     <w:p>
@@ -1251,7 +1376,31 @@
           <w:lang w:eastAsia="pt-BR"/>
           <w14:ligatures w14:val="none"/>
         </w:rPr>
-        <w:t xml:space="preserve"> (Projeto independente, 2023 – Atual) Este projeto explora a aplicação da hipnose ericksoniana como ferramenta terapêutica para indivíduos com Transtorno do Espectro Autista (TEA), especialmente adultos. A pesquisa investiga como a comunicação simbólica e a manipulação de fenômenos hipnóticos podem facilitar a construção de rapport e a remodelação de sintomas.</w:t>
+        <w:t xml:space="preserve"> (Projeto independente, 2023 – Atual</w:t>
+      </w:r>
+      <w:proofErr w:type="gramStart"/>
+      <w:r>
+        <w:rPr>
+          <w:rFonts w:eastAsia="Times New Roman" w:cs="Times New Roman"/>
+          <w:kern w:val="0"/>
+          <w:sz w:val="24"/>
+          <w:szCs w:val="24"/>
+          <w:lang w:eastAsia="pt-BR"/>
+          <w14:ligatures w14:val="none"/>
+        </w:rPr>
+        <w:t>) Este</w:t>
+      </w:r>
+      <w:proofErr w:type="gramEnd"/>
+      <w:r>
+        <w:rPr>
+          <w:rFonts w:eastAsia="Times New Roman" w:cs="Times New Roman"/>
+          <w:kern w:val="0"/>
+          <w:sz w:val="24"/>
+          <w:szCs w:val="24"/>
+          <w:lang w:eastAsia="pt-BR"/>
+          <w14:ligatures w14:val="none"/>
+        </w:rPr>
+        <w:t xml:space="preserve"> projeto explora a aplicação da hipnose ericksoniana como ferramenta terapêutica para indivíduos com Transtorno do Espectro Autista (TEA), especialmente adultos. A pesquisa investiga como a comunicação simbólica e a manipulação de fenômenos hipnóticos podem facilitar a construção de rapport e a remodelação de sintomas.</w:t>
       </w:r>
     </w:p>
     <w:p>
@@ -1295,6 +1444,7 @@
         </w:rPr>
         <w:t xml:space="preserve"> (2014 – Atual) Desenvolvimento de uma escala psicométrica para TEA em adultos, baseada na </w:t>
       </w:r>
+      <w:proofErr w:type="spellStart"/>
       <w:r>
         <w:rPr>
           <w:rFonts w:eastAsia="Times New Roman" w:cs="Times New Roman"/>
@@ -1306,8 +1456,37 @@
           <w:lang w:eastAsia="pt-BR"/>
           <w14:ligatures w14:val="none"/>
         </w:rPr>
-        <w:t>Autism-Spectrum Quotient</w:t>
-      </w:r>
+        <w:t>Autism</w:t>
+      </w:r>
+      <w:proofErr w:type="spellEnd"/>
+      <w:r>
+        <w:rPr>
+          <w:rFonts w:eastAsia="Times New Roman" w:cs="Times New Roman"/>
+          <w:i/>
+          <w:iCs/>
+          <w:kern w:val="0"/>
+          <w:sz w:val="24"/>
+          <w:szCs w:val="24"/>
+          <w:lang w:eastAsia="pt-BR"/>
+          <w14:ligatures w14:val="none"/>
+        </w:rPr>
+        <w:t xml:space="preserve">-Spectrum </w:t>
+      </w:r>
+      <w:proofErr w:type="spellStart"/>
+      <w:r>
+        <w:rPr>
+          <w:rFonts w:eastAsia="Times New Roman" w:cs="Times New Roman"/>
+          <w:i/>
+          <w:iCs/>
+          <w:kern w:val="0"/>
+          <w:sz w:val="24"/>
+          <w:szCs w:val="24"/>
+          <w:lang w:eastAsia="pt-BR"/>
+          <w14:ligatures w14:val="none"/>
+        </w:rPr>
+        <w:t>Quotient</w:t>
+      </w:r>
+      <w:proofErr w:type="spellEnd"/>
       <w:r>
         <w:rPr>
           <w:rFonts w:eastAsia="Times New Roman" w:cs="Times New Roman"/>
@@ -1383,6 +1562,7 @@
         <w:pStyle w:val="NormalWeb"/>
         <w:spacing w:before="0" w:beforeAutospacing="0" w:after="0" w:afterAutospacing="0"/>
       </w:pPr>
+      <w:proofErr w:type="gramStart"/>
       <w:r>
         <w:rPr>
           <w:rFonts w:hAnsi="Symbol"/>
@@ -1397,7 +1577,15 @@
           <w:b/>
           <w:bCs/>
         </w:rPr>
-        <w:t>Santana, V. L. B.</w:t>
+        <w:t>Santana</w:t>
+      </w:r>
+      <w:proofErr w:type="gramEnd"/>
+      <w:r>
+        <w:rPr>
+          <w:b/>
+          <w:bCs/>
+        </w:rPr>
+        <w:t>, V. L. B.</w:t>
       </w:r>
       <w:r>
         <w:t xml:space="preserve">, &amp; Morais, J. F. (2023). O Transtorno do Espectro Autista (TEA) e o Potencial de Estabelecimento de Rapport (PER). </w:t>
@@ -1443,6 +1631,7 @@
         <w:pStyle w:val="NormalWeb"/>
         <w:spacing w:before="0" w:beforeAutospacing="0" w:after="0" w:afterAutospacing="0"/>
       </w:pPr>
+      <w:proofErr w:type="gramStart"/>
       <w:r>
         <w:rPr>
           <w:rFonts w:hAnsi="Symbol"/>
@@ -1457,7 +1646,15 @@
           <w:b/>
           <w:bCs/>
         </w:rPr>
-        <w:t>Santana, V. L. B.</w:t>
+        <w:t>Santana</w:t>
+      </w:r>
+      <w:proofErr w:type="gramEnd"/>
+      <w:r>
+        <w:rPr>
+          <w:b/>
+          <w:bCs/>
+        </w:rPr>
+        <w:t>, V. L. B.</w:t>
       </w:r>
       <w:r>
         <w:t xml:space="preserve"> (2023). </w:t>
@@ -1483,8 +1680,17 @@
           <w:i/>
           <w:iCs/>
         </w:rPr>
-        <w:t>Revista Fisio&amp;Terapia</w:t>
-      </w:r>
+        <w:t xml:space="preserve">Revista </w:t>
+      </w:r>
+      <w:proofErr w:type="spellStart"/>
+      <w:r>
+        <w:rPr>
+          <w:i/>
+          <w:iCs/>
+        </w:rPr>
+        <w:t>Fisio&amp;Terapia</w:t>
+      </w:r>
+      <w:proofErr w:type="spellEnd"/>
       <w:r>
         <w:t>.</w:t>
       </w:r>
@@ -1497,6 +1703,7 @@
           <w:lang w:val="en-US"/>
         </w:rPr>
       </w:pPr>
+      <w:proofErr w:type="gramStart"/>
       <w:r>
         <w:rPr>
           <w:rFonts w:hAnsi="Symbol"/>
@@ -1511,7 +1718,15 @@
           <w:b/>
           <w:bCs/>
         </w:rPr>
-        <w:t>Santana, V. L. B.</w:t>
+        <w:t>Santana</w:t>
+      </w:r>
+      <w:proofErr w:type="gramEnd"/>
+      <w:r>
+        <w:rPr>
+          <w:b/>
+          <w:bCs/>
+        </w:rPr>
+        <w:t>, V. L. B.</w:t>
       </w:r>
       <w:r>
         <w:t xml:space="preserve"> (2023). </w:t>
@@ -1522,7 +1737,25 @@
           <w:rFonts w:eastAsiaTheme="majorEastAsia"/>
           <w:lang w:val="en-US"/>
         </w:rPr>
-        <w:t>The Use of The Hypnotic Phenomenon To Reshape the Symptom: Two Cases</w:t>
+        <w:t xml:space="preserve">The Use of The Hypnotic Phenomenon </w:t>
+      </w:r>
+      <w:proofErr w:type="gramStart"/>
+      <w:r>
+        <w:rPr>
+          <w:rStyle w:val="citation-1482"/>
+          <w:rFonts w:eastAsiaTheme="majorEastAsia"/>
+          <w:lang w:val="en-US"/>
+        </w:rPr>
+        <w:t>To</w:t>
+      </w:r>
+      <w:proofErr w:type="gramEnd"/>
+      <w:r>
+        <w:rPr>
+          <w:rStyle w:val="citation-1482"/>
+          <w:rFonts w:eastAsiaTheme="majorEastAsia"/>
+          <w:lang w:val="en-US"/>
+        </w:rPr>
+        <w:t xml:space="preserve"> Reshape the Symptom: Two Cases</w:t>
       </w:r>
       <w:r>
         <w:rPr>
@@ -1559,6 +1792,7 @@
         <w:pStyle w:val="NormalWeb"/>
         <w:spacing w:before="0" w:beforeAutospacing="0" w:after="0" w:afterAutospacing="0"/>
       </w:pPr>
+      <w:proofErr w:type="gramStart"/>
       <w:r>
         <w:rPr>
           <w:rFonts w:hAnsi="Symbol"/>
@@ -1577,7 +1811,16 @@
           <w:bCs/>
           <w:lang w:val="en-US"/>
         </w:rPr>
-        <w:t>Morais, J. F., Kerr, T. B., Santana, V. L. B.</w:t>
+        <w:t>Morais</w:t>
+      </w:r>
+      <w:proofErr w:type="gramEnd"/>
+      <w:r>
+        <w:rPr>
+          <w:b/>
+          <w:bCs/>
+          <w:lang w:val="en-US"/>
+        </w:rPr>
+        <w:t>, J. F., Kerr, T. B., Santana, V. L. B.</w:t>
       </w:r>
       <w:r>
         <w:rPr>
@@ -1619,6 +1862,7 @@
         <w:pStyle w:val="NormalWeb"/>
         <w:spacing w:before="0" w:beforeAutospacing="0" w:after="0" w:afterAutospacing="0"/>
       </w:pPr>
+      <w:proofErr w:type="gramStart"/>
       <w:r>
         <w:rPr>
           <w:rFonts w:hAnsi="Symbol"/>
@@ -1633,7 +1877,15 @@
           <w:b/>
           <w:bCs/>
         </w:rPr>
-        <w:t>Morais, J. F., Santana, V. L. B., &amp; Kerr, T. B.</w:t>
+        <w:t>Morais</w:t>
+      </w:r>
+      <w:proofErr w:type="gramEnd"/>
+      <w:r>
+        <w:rPr>
+          <w:b/>
+          <w:bCs/>
+        </w:rPr>
+        <w:t>, J. F., Santana, V. L. B., &amp; Kerr, T. B.</w:t>
       </w:r>
       <w:r>
         <w:t xml:space="preserve"> (2018). Tradução e Validação, para o português do Brasil, da Escala de Quociente do Espectro Autista (AQ10). </w:t>
@@ -1651,6 +1903,7 @@
           <w:i/>
           <w:iCs/>
         </w:rPr>
+        <w:lastRenderedPageBreak/>
         <w:t>Atas do 10º Congresso da AIDAP/AIDEP</w:t>
       </w:r>
       <w:r>
@@ -1669,6 +1922,7 @@
         <w:pStyle w:val="NormalWeb"/>
         <w:spacing w:before="0" w:beforeAutospacing="0" w:after="0" w:afterAutospacing="0"/>
       </w:pPr>
+      <w:proofErr w:type="gramStart"/>
       <w:r>
         <w:rPr>
           <w:rFonts w:hAnsi="Symbol"/>
@@ -1683,7 +1937,15 @@
           <w:b/>
           <w:bCs/>
         </w:rPr>
-        <w:t>Morais, J. F., &amp; Santana, V. L. B.</w:t>
+        <w:t>Morais</w:t>
+      </w:r>
+      <w:proofErr w:type="gramEnd"/>
+      <w:r>
+        <w:rPr>
+          <w:b/>
+          <w:bCs/>
+        </w:rPr>
+        <w:t>, J. F., &amp; Santana, V. L. B.</w:t>
       </w:r>
       <w:r>
         <w:t xml:space="preserve"> (2015). </w:t>
@@ -1694,6 +1956,7 @@
         </w:rPr>
         <w:t xml:space="preserve">A trace scale of autistic spectrum disorder in young adults [Resumo]. </w:t>
       </w:r>
+      <w:proofErr w:type="spellStart"/>
       <w:r>
         <w:rPr>
           <w:rStyle w:val="citation-1479"/>
@@ -1701,8 +1964,49 @@
           <w:i/>
           <w:iCs/>
         </w:rPr>
-        <w:t>Archives of Clinical Psychiatry</w:t>
-      </w:r>
+        <w:t>Archives</w:t>
+      </w:r>
+      <w:proofErr w:type="spellEnd"/>
+      <w:r>
+        <w:rPr>
+          <w:rStyle w:val="citation-1479"/>
+          <w:rFonts w:eastAsiaTheme="majorEastAsia"/>
+          <w:i/>
+          <w:iCs/>
+        </w:rPr>
+        <w:t xml:space="preserve"> </w:t>
+      </w:r>
+      <w:proofErr w:type="spellStart"/>
+      <w:r>
+        <w:rPr>
+          <w:rStyle w:val="citation-1479"/>
+          <w:rFonts w:eastAsiaTheme="majorEastAsia"/>
+          <w:i/>
+          <w:iCs/>
+        </w:rPr>
+        <w:t>of</w:t>
+      </w:r>
+      <w:proofErr w:type="spellEnd"/>
+      <w:r>
+        <w:rPr>
+          <w:rStyle w:val="citation-1479"/>
+          <w:rFonts w:eastAsiaTheme="majorEastAsia"/>
+          <w:i/>
+          <w:iCs/>
+        </w:rPr>
+        <w:t xml:space="preserve"> Clinical </w:t>
+      </w:r>
+      <w:proofErr w:type="spellStart"/>
+      <w:r>
+        <w:rPr>
+          <w:rStyle w:val="citation-1479"/>
+          <w:rFonts w:eastAsiaTheme="majorEastAsia"/>
+          <w:i/>
+          <w:iCs/>
+        </w:rPr>
+        <w:t>Psychiatry</w:t>
+      </w:r>
+      <w:proofErr w:type="spellEnd"/>
       <w:r>
         <w:rPr>
           <w:rStyle w:val="citation-1479"/>
@@ -1737,7 +2041,6 @@
           <w:lang w:eastAsia="pt-BR"/>
           <w14:ligatures w14:val="none"/>
         </w:rPr>
-        <w:lastRenderedPageBreak/>
         <w:pict w14:anchorId="247AE97B">
           <v:rect id="_x0000_i1030" style="width:0;height:1.5pt" o:hralign="center" o:hrstd="t" o:hr="t" fillcolor="#a0a0a0" stroked="f"/>
         </w:pict>
@@ -2286,7 +2589,14 @@
         <w:rPr>
           <w:lang w:val="en-US"/>
         </w:rPr>
-        <w:t>Advanced Techniques of Hypnosis Therapy. Symbolic Hypnotherapy [stream] (The Milton H. Erickson Foundation, Inc. is approved by the American Psychological Association to sponsor continuing education for psychologists. The Milton H. Erickson Foundation, Inc. maintains responsibility for this program and its content).</w:t>
+        <w:t xml:space="preserve">Advanced Techniques of Hypnosis Therapy. Symbolic Hypnotherapy [stream] (The Milton H. Erickson Foundation, Inc. is approved by the American Psychological </w:t>
+      </w:r>
+      <w:r>
+        <w:rPr>
+          <w:lang w:val="en-US"/>
+        </w:rPr>
+        <w:lastRenderedPageBreak/>
+        <w:t>Association to sponsor continuing education for psychologists. The Milton H. Erickson Foundation, Inc. maintains responsibility for this program and its content).</w:t>
       </w:r>
     </w:p>
     <w:p>
@@ -2303,7 +2613,6 @@
         <w:rPr>
           <w:lang w:val="en-US"/>
         </w:rPr>
-        <w:lastRenderedPageBreak/>
         <w:t>Advanced Techniques of Hypnosis &amp;amp; Therapy: Therapy within a Marital System (The Milton H. Erickson Foundation, Inc. is approved by the American Psychological Association to sponsor continuing education for psychologists. The Milton H. Erickson Foundation, Inc. maintains responsibility for this program and its content).</w:t>
       </w:r>
     </w:p>
@@ -2389,7 +2698,21 @@
         <w:rPr>
           <w:lang w:val="en-US"/>
         </w:rPr>
-        <w:t>IC07 Fundamentals of Hypnosis 01 - The Phenomenology of Induction - Jeffrey Zeig, PhD. Original Program Date : Dec 07, 2007 (PST). The Milton H. Erickson Foundation, Inc.</w:t>
+        <w:t xml:space="preserve">IC07 Fundamentals of Hypnosis 01 - The Phenomenology of Induction - Jeffrey Zeig, PhD. Original Program </w:t>
+      </w:r>
+      <w:proofErr w:type="gramStart"/>
+      <w:r>
+        <w:rPr>
+          <w:lang w:val="en-US"/>
+        </w:rPr>
+        <w:t>Date :</w:t>
+      </w:r>
+      <w:proofErr w:type="gramEnd"/>
+      <w:r>
+        <w:rPr>
+          <w:lang w:val="en-US"/>
+        </w:rPr>
+        <w:t xml:space="preserve"> Dec 07, 2007 (PST). The Milton H. Erickson Foundation, Inc.</w:t>
       </w:r>
     </w:p>
     <w:p>
@@ -2440,7 +2763,14 @@
         <w:rPr>
           <w:lang w:val="en-US"/>
         </w:rPr>
-        <w:t>Dr. Erickson and Three Cases of Trauma (The Milton H. Erickson Foundation, Inc. is approved by the American Psychological Association to sponsor continuing education for psychologists. The Milton H. Erickson Foundation, Inc. maintains responsibility for this program and its content).</w:t>
+        <w:t xml:space="preserve">Dr. Erickson and Three Cases of Trauma (The Milton H. Erickson Foundation, Inc. is approved by the American Psychological Association to sponsor continuing education for </w:t>
+      </w:r>
+      <w:r>
+        <w:rPr>
+          <w:lang w:val="en-US"/>
+        </w:rPr>
+        <w:lastRenderedPageBreak/>
+        <w:t>psychologists. The Milton H. Erickson Foundation, Inc. maintains responsibility for this program and its content).</w:t>
       </w:r>
     </w:p>
     <w:p>
@@ -2457,8 +2787,21 @@
         <w:rPr>
           <w:lang w:val="en-US"/>
         </w:rPr>
-        <w:lastRenderedPageBreak/>
-        <w:t>Milton Erickson, MD - Conquering Phobias through Ericksonian Therapy (The Milton H. Erickson Foundation, Inc. is approved by the American Psychological Association to sponsor continuing education for psychologists. The Milton H. Erickson Foundation, Inc. maintains responsibility for this program and its content).</w:t>
+        <w:t xml:space="preserve">Milton Erickson, MD - Conquering Phobias through </w:t>
+      </w:r>
+      <w:proofErr w:type="spellStart"/>
+      <w:r>
+        <w:rPr>
+          <w:lang w:val="en-US"/>
+        </w:rPr>
+        <w:t>Ericksonian</w:t>
+      </w:r>
+      <w:proofErr w:type="spellEnd"/>
+      <w:r>
+        <w:rPr>
+          <w:lang w:val="en-US"/>
+        </w:rPr>
+        <w:t xml:space="preserve"> Therapy (The Milton H. Erickson Foundation, Inc. is approved by the American Psychological Association to sponsor continuing education for psychologists. The Milton H. Erickson Foundation, Inc. maintains responsibility for this program and its content).</w:t>
       </w:r>
     </w:p>
     <w:p>
@@ -2540,10 +2883,32 @@
         <w:rPr>
           <w:lang w:val="en-US"/>
         </w:rPr>
-        <w:t xml:space="preserve">In The Room With Milton Erickson Vol. </w:t>
-      </w:r>
-      <w:r>
-        <w:t>I to 6 - Milton Erickson</w:t>
+        <w:t xml:space="preserve">In The Room </w:t>
+      </w:r>
+      <w:proofErr w:type="gramStart"/>
+      <w:r>
+        <w:rPr>
+          <w:lang w:val="en-US"/>
+        </w:rPr>
+        <w:t>With</w:t>
+      </w:r>
+      <w:proofErr w:type="gramEnd"/>
+      <w:r>
+        <w:rPr>
+          <w:lang w:val="en-US"/>
+        </w:rPr>
+        <w:t xml:space="preserve"> Milton Erickson Vol. </w:t>
+      </w:r>
+      <w:r>
+        <w:t xml:space="preserve">I </w:t>
+      </w:r>
+      <w:proofErr w:type="spellStart"/>
+      <w:r>
+        <w:t>to</w:t>
+      </w:r>
+      <w:proofErr w:type="spellEnd"/>
+      <w:r>
+        <w:t xml:space="preserve"> 6 - Milton Erickson</w:t>
       </w:r>
     </w:p>
     <w:p>
@@ -2611,7 +2976,14 @@
         <w:rPr>
           <w:lang w:val="en-US"/>
         </w:rPr>
-        <w:t>Healing ADD - Daniel Amen, MD - EP20 Workshop 23. (The Milton H. Erickson Foundation, Inc. is approved by the American Psychological Association to sponsor continuing education for psychologists. The Milton H. Erickson Foundation, Inc. maintains responsibility for this program and its content).</w:t>
+        <w:t xml:space="preserve">Healing ADD - Daniel Amen, MD - EP20 Workshop 23. (The Milton H. Erickson Foundation, Inc. is approved by the American Psychological Association to sponsor </w:t>
+      </w:r>
+      <w:r>
+        <w:rPr>
+          <w:lang w:val="en-US"/>
+        </w:rPr>
+        <w:lastRenderedPageBreak/>
+        <w:t>continuing education for psychologists. The Milton H. Erickson Foundation, Inc. maintains responsibility for this program and its content).</w:t>
       </w:r>
     </w:p>
     <w:p>
@@ -2628,7 +3000,6 @@
         <w:rPr>
           <w:lang w:val="en-US"/>
         </w:rPr>
-        <w:lastRenderedPageBreak/>
         <w:t>James Bugental, PhD - Present Tense Self Exploration. (The Milton H. Erickson Foundation, Inc. is approved by the American Psychological Association to sponsor continuing education for psychologists. The Milton H. Erickson Foundation, Inc. maintains responsibility for this program and its content).</w:t>
       </w:r>
     </w:p>
@@ -2646,7 +3017,37 @@
         <w:rPr>
           <w:lang w:val="en-US"/>
         </w:rPr>
-        <w:t>Experiential Empathy in Ericksonian Therapy - Jeffrey Zeig, Ph.D - IC04 Clinical Demonstration 01 (The Milton H. Erickson Foundation, Inc. is approved by the American Psychological Association to sponsor continuing education for psychologists. The Milton H. Erickson Foundation, Inc. maintains responsibility for this program and its content).</w:t>
+        <w:t xml:space="preserve">Experiential Empathy in </w:t>
+      </w:r>
+      <w:proofErr w:type="spellStart"/>
+      <w:r>
+        <w:rPr>
+          <w:lang w:val="en-US"/>
+        </w:rPr>
+        <w:t>Ericksonian</w:t>
+      </w:r>
+      <w:proofErr w:type="spellEnd"/>
+      <w:r>
+        <w:rPr>
+          <w:lang w:val="en-US"/>
+        </w:rPr>
+        <w:t xml:space="preserve"> Therapy - Jeffrey Zeig, </w:t>
+      </w:r>
+      <w:proofErr w:type="spellStart"/>
+      <w:proofErr w:type="gramStart"/>
+      <w:r>
+        <w:rPr>
+          <w:lang w:val="en-US"/>
+        </w:rPr>
+        <w:t>Ph.D</w:t>
+      </w:r>
+      <w:proofErr w:type="spellEnd"/>
+      <w:proofErr w:type="gramEnd"/>
+      <w:r>
+        <w:rPr>
+          <w:lang w:val="en-US"/>
+        </w:rPr>
+        <w:t xml:space="preserve"> - IC04 Clinical Demonstration 01 (The Milton H. Erickson Foundation, Inc. is approved by the American Psychological Association to sponsor continuing education for psychologists. The Milton H. Erickson Foundation, Inc. maintains responsibility for this program and its content).</w:t>
       </w:r>
     </w:p>
     <w:p>
@@ -6423,7 +6824,6 @@
   <w:style w:type="character" w:default="1" w:styleId="Fontepargpadro">
     <w:name w:val="Default Paragraph Font"/>
     <w:uiPriority w:val="1"/>
-    <w:semiHidden/>
     <w:unhideWhenUsed/>
   </w:style>
   <w:style w:type="table" w:default="1" w:styleId="Tabelanormal">

</xml_diff>